<commit_message>
Python class stuff - Final project stuff
</commit_message>
<xml_diff>
--- a/CS 4800 - Captsone/Logbook.docx
+++ b/CS 4800 - Captsone/Logbook.docx
@@ -2250,6 +2250,167 @@
       <w:r>
         <w:t>Successfully have gauge printing to the screen when clicked on.</w:t>
       </w:r>
+    </w:p>
+    <w:p>
+      <w:pPr>
+        <w:pStyle w:val="ListParagraph"/>
+        <w:numPr>
+          <w:ilvl w:val="0"/>
+          <w:numId w:val="2"/>
+        </w:numPr>
+      </w:pPr>
+    </w:p>
+    <w:p>
+      <w:pPr>
+        <w:ind w:left="360"/>
+      </w:pPr>
+      <w:r>
+        <w:t>10-23-2025</w:t>
+      </w:r>
+    </w:p>
+    <w:p>
+      <w:pPr>
+        <w:pStyle w:val="ListParagraph"/>
+        <w:numPr>
+          <w:ilvl w:val="0"/>
+          <w:numId w:val="2"/>
+        </w:numPr>
+      </w:pPr>
+      <w:r>
+        <w:t>Figured out issue with getting variables and meshes to appear.  Meshes needed to be further declared in the .cpp constructor class, while variables show up in the Details panel on the right.</w:t>
+      </w:r>
+    </w:p>
+    <w:p>
+      <w:pPr>
+        <w:pStyle w:val="ListParagraph"/>
+        <w:numPr>
+          <w:ilvl w:val="0"/>
+          <w:numId w:val="2"/>
+        </w:numPr>
+      </w:pPr>
+      <w:r>
+        <w:t>New cylinder and arrow mesh implemented again.</w:t>
+      </w:r>
+    </w:p>
+    <w:p>
+      <w:pPr>
+        <w:pStyle w:val="ListParagraph"/>
+        <w:numPr>
+          <w:ilvl w:val="0"/>
+          <w:numId w:val="2"/>
+        </w:numPr>
+      </w:pPr>
+      <w:r>
+        <w:t>Rotation logic for the needle successfully implemented.  Needle changes position based on the DisplayValue variable</w:t>
+      </w:r>
+      <w:r>
+        <w:t xml:space="preserve"> that is being printed to screen</w:t>
+      </w:r>
+      <w:r>
+        <w:t>.</w:t>
+      </w:r>
+    </w:p>
+    <w:p>
+      <w:pPr>
+        <w:pStyle w:val="ListParagraph"/>
+        <w:numPr>
+          <w:ilvl w:val="0"/>
+          <w:numId w:val="2"/>
+        </w:numPr>
+      </w:pPr>
+      <w:r>
+        <w:t xml:space="preserve">Attempting to </w:t>
+      </w:r>
+      <w:r>
+        <w:t xml:space="preserve">rebuild the player control system to implement more useful controls.  </w:t>
+      </w:r>
+      <w:r>
+        <w:t>Goal</w:t>
+      </w:r>
+      <w:r>
+        <w:t>:  WASD movement, camera attached to mouse, retain clicking on objects.</w:t>
+      </w:r>
+    </w:p>
+    <w:p>
+      <w:pPr>
+        <w:pStyle w:val="ListParagraph"/>
+        <w:numPr>
+          <w:ilvl w:val="0"/>
+          <w:numId w:val="2"/>
+        </w:numPr>
+      </w:pPr>
+      <w:r>
+        <w:t xml:space="preserve">Character </w:t>
+      </w:r>
+      <w:r>
+        <w:t>and camera movement</w:t>
+      </w:r>
+      <w:r>
+        <w:t xml:space="preserve"> achieved.  Had to realize that </w:t>
+      </w:r>
+      <w:r>
+        <w:t>some EventGraph mapping can only occur in the pawn/character instead of the PlayerController.  Next step is to start modeling the gauge.</w:t>
+      </w:r>
+    </w:p>
+    <w:p/>
+    <w:p>
+      <w:pPr>
+        <w:ind w:left="360"/>
+      </w:pPr>
+      <w:r>
+        <w:t>10-24-2025</w:t>
+      </w:r>
+    </w:p>
+    <w:p>
+      <w:pPr>
+        <w:pStyle w:val="ListParagraph"/>
+        <w:numPr>
+          <w:ilvl w:val="0"/>
+          <w:numId w:val="2"/>
+        </w:numPr>
+      </w:pPr>
+      <w:r>
+        <w:t>PLCs store whatever data is put onto their bytes, 1 bit for coils and discrete inputs, and 16 bits for input and holding registers.</w:t>
+      </w:r>
+    </w:p>
+    <w:p>
+      <w:pPr>
+        <w:pStyle w:val="ListParagraph"/>
+        <w:numPr>
+          <w:ilvl w:val="0"/>
+          <w:numId w:val="2"/>
+        </w:numPr>
+      </w:pPr>
+      <w:r>
+        <w:t>This data is encoded by the user and is left up to interpretation; all we need is a way to simulate those bits.  This should be the task of the emulator</w:t>
+      </w:r>
+      <w:r>
+        <w:t>/server</w:t>
+      </w:r>
+      <w:r>
+        <w:t>.</w:t>
+      </w:r>
+    </w:p>
+    <w:p>
+      <w:pPr>
+        <w:pStyle w:val="ListParagraph"/>
+        <w:numPr>
+          <w:ilvl w:val="0"/>
+          <w:numId w:val="2"/>
+        </w:numPr>
+      </w:pPr>
+      <w:r>
+        <w:t>A PLC is essentially just a storage device that will contain information being sent by sensors and other devices.  The PLC handles taking in that data and then other software reads and translates it.  The data is often in the form of something like registers with labels such as 40001, which indicate the row.  This label is then used to access the data at that register location.</w:t>
+      </w:r>
+    </w:p>
+    <w:p>
+      <w:pPr>
+        <w:pStyle w:val="ListParagraph"/>
+        <w:numPr>
+          <w:ilvl w:val="0"/>
+          <w:numId w:val="2"/>
+        </w:numPr>
+      </w:pPr>
     </w:p>
     <w:sectPr>
       <w:pgSz w:w="12240" w:h="15840"/>

</xml_diff>

<commit_message>
Capstone meetings and documents
Also stuff for Python for Machine Learning (4771)
</commit_message>
<xml_diff>
--- a/CS 4800 - Captsone/Logbook.docx
+++ b/CS 4800 - Captsone/Logbook.docx
@@ -2403,6 +2403,273 @@
         <w:t>A PLC is essentially just a storage device that will contain information being sent by sensors and other devices.  The PLC handles taking in that data and then other software reads and translates it.  The data is often in the form of something like registers with labels such as 40001, which indicate the row.  This label is then used to access the data at that register location.</w:t>
       </w:r>
     </w:p>
+    <w:p/>
+    <w:p/>
+    <w:p>
+      <w:pPr>
+        <w:ind w:left="360"/>
+      </w:pPr>
+      <w:r>
+        <w:t>11-11-2025</w:t>
+      </w:r>
+    </w:p>
+    <w:p>
+      <w:pPr>
+        <w:pStyle w:val="ListParagraph"/>
+        <w:numPr>
+          <w:ilvl w:val="0"/>
+          <w:numId w:val="2"/>
+        </w:numPr>
+      </w:pPr>
+      <w:r>
+        <w:t>Upgraded the visuals on the gauge again, adding colored tick marks and a gauge face.</w:t>
+      </w:r>
+    </w:p>
+    <w:p>
+      <w:pPr>
+        <w:pStyle w:val="ListParagraph"/>
+        <w:numPr>
+          <w:ilvl w:val="0"/>
+          <w:numId w:val="2"/>
+        </w:numPr>
+      </w:pPr>
+      <w:r>
+        <w:t>Updated python and got emulator client working.</w:t>
+      </w:r>
+    </w:p>
+    <w:p>
+      <w:pPr>
+        <w:pStyle w:val="ListParagraph"/>
+        <w:numPr>
+          <w:ilvl w:val="0"/>
+          <w:numId w:val="2"/>
+        </w:numPr>
+      </w:pPr>
+      <w:r>
+        <w:lastRenderedPageBreak/>
+        <w:t>Started process of trying to taking input from emulator and add into sample scene.</w:t>
+      </w:r>
+    </w:p>
+    <w:p>
+      <w:pPr>
+        <w:pStyle w:val="ListParagraph"/>
+        <w:numPr>
+          <w:ilvl w:val="0"/>
+          <w:numId w:val="2"/>
+        </w:numPr>
+      </w:pPr>
+      <w:r>
+        <w:t>Finding difficulty in including nanoModbus.h.  The file can’t be found despite being added to the build.cs file.  Problem seems to be in how the build.cs file is being used.</w:t>
+      </w:r>
+    </w:p>
+    <w:p>
+      <w:pPr>
+        <w:pStyle w:val="ListParagraph"/>
+        <w:numPr>
+          <w:ilvl w:val="0"/>
+          <w:numId w:val="2"/>
+        </w:numPr>
+      </w:pPr>
+      <w:r>
+        <w:t xml:space="preserve">Attempting to put project files into plugin files so as to solve the issue.  Compilation time and </w:t>
+      </w:r>
+      <w:r>
+        <w:t>rebuilding the VS sln file</w:t>
+      </w:r>
+      <w:r>
+        <w:t xml:space="preserve"> time slowing tasks down.</w:t>
+      </w:r>
+      <w:r>
+        <w:t xml:space="preserve">  Have not been able to test in the editor, will need to make changes based on the new file paths.</w:t>
+      </w:r>
+    </w:p>
+    <w:p>
+      <w:pPr>
+        <w:pStyle w:val="ListParagraph"/>
+        <w:numPr>
+          <w:ilvl w:val="0"/>
+          <w:numId w:val="2"/>
+        </w:numPr>
+      </w:pPr>
+      <w:r>
+        <w:t>Needed to entirely rebuild the project solution using the .uproject file in order for the build.cs file to work correctly.</w:t>
+      </w:r>
+    </w:p>
+    <w:p>
+      <w:pPr>
+        <w:pStyle w:val="ListParagraph"/>
+        <w:numPr>
+          <w:ilvl w:val="0"/>
+          <w:numId w:val="2"/>
+        </w:numPr>
+      </w:pPr>
+      <w:r>
+        <w:t>Got nanoModbus.h working, but still needed integration for nanoModbus.c.</w:t>
+      </w:r>
+    </w:p>
+    <w:p>
+      <w:pPr>
+        <w:pStyle w:val="ListParagraph"/>
+        <w:numPr>
+          <w:ilvl w:val="0"/>
+          <w:numId w:val="2"/>
+        </w:numPr>
+      </w:pPr>
+      <w:r>
+        <w:t>Converting nanoModbus.c into nanoModbus.cpp has helped with compiler problems.  The .c file was not being recognized.</w:t>
+      </w:r>
+      <w:r>
+        <w:t xml:space="preserve">  This new file type could cause issues later.</w:t>
+      </w:r>
+    </w:p>
+    <w:p>
+      <w:pPr>
+        <w:pStyle w:val="ListParagraph"/>
+        <w:numPr>
+          <w:ilvl w:val="0"/>
+          <w:numId w:val="2"/>
+        </w:numPr>
+      </w:pPr>
+      <w:r>
+        <w:t xml:space="preserve">nanoModbus.h is missing some </w:t>
+      </w:r>
+      <w:r>
+        <w:t>functions</w:t>
+      </w:r>
+      <w:r>
+        <w:t xml:space="preserve"> that would wrap the .c file</w:t>
+      </w:r>
+      <w:r>
+        <w:t>.  We need to flesh out the header file with the missing functions, as they are not being recognized due to being c code.  This means adding more nmbs_error lines to the header file for the missing functions.</w:t>
+      </w:r>
+    </w:p>
+    <w:p/>
+    <w:p/>
+    <w:p>
+      <w:pPr>
+        <w:ind w:firstLine="360"/>
+      </w:pPr>
+      <w:r>
+        <w:t>11-12-2025:</w:t>
+      </w:r>
+    </w:p>
+    <w:p>
+      <w:pPr>
+        <w:pStyle w:val="ListParagraph"/>
+        <w:numPr>
+          <w:ilvl w:val="0"/>
+          <w:numId w:val="2"/>
+        </w:numPr>
+      </w:pPr>
+      <w:r>
+        <w:t>Discovery that the nanoModbus library we are using is incomplete deliberately.  Read() and write() functions, as well as others, are expected to be written by the user from commands provided.  This means needing to create adaptor functions between nanoModbus and Unreal so as to access the open port from the emulator.</w:t>
+      </w:r>
+    </w:p>
+    <w:p>
+      <w:pPr>
+        <w:pStyle w:val="ListParagraph"/>
+        <w:numPr>
+          <w:ilvl w:val="0"/>
+          <w:numId w:val="2"/>
+        </w:numPr>
+      </w:pPr>
+      <w:r>
+        <w:t>Looking into using the Unreal socket system to act in place of missing read() write().</w:t>
+      </w:r>
+    </w:p>
+    <w:p/>
+    <w:p/>
+    <w:p>
+      <w:r>
+        <w:t>Capstone Design Review – 11-13-2025</w:t>
+      </w:r>
+    </w:p>
+    <w:p/>
+    <w:p/>
+    <w:p>
+      <w:r>
+        <w:t>General Work:</w:t>
+      </w:r>
+    </w:p>
+    <w:p>
+      <w:r>
+        <w:tab/>
+        <w:t>11-14-2024:</w:t>
+      </w:r>
+    </w:p>
+    <w:p>
+      <w:pPr>
+        <w:pStyle w:val="ListParagraph"/>
+        <w:numPr>
+          <w:ilvl w:val="0"/>
+          <w:numId w:val="2"/>
+        </w:numPr>
+      </w:pPr>
+      <w:r>
+        <w:t>Realized that Modbus encoding needs to happen at several different stages of the process in order to account for different devices available in the world.  Some devices output Modbus raw data, others output translated data.  We may need a client that can do both.</w:t>
+      </w:r>
+    </w:p>
+    <w:p/>
+    <w:p>
+      <w:pPr>
+        <w:ind w:left="360"/>
+      </w:pPr>
+      <w:r>
+        <w:lastRenderedPageBreak/>
+        <w:t>11-16-2025</w:t>
+      </w:r>
+    </w:p>
+    <w:p>
+      <w:pPr>
+        <w:pStyle w:val="ListParagraph"/>
+        <w:numPr>
+          <w:ilvl w:val="0"/>
+          <w:numId w:val="2"/>
+        </w:numPr>
+      </w:pPr>
+      <w:r>
+        <w:t>Unreal requires a different folder path system than is allowed by Visual Studio.  To recognize files, Unreal needs a Public/Private path.  This breaks Visual Studio, which cannot recognize files that are separated into different folders.</w:t>
+      </w:r>
+      <w:r>
+        <w:t xml:space="preserve">  If a header file is in a different folder from its cpp, it cannot be recognized.  This extends to plugin files such as the nanoModbus library, which is in a different folder.  The plugin files cannot recognize Unreal libraries, and vice versa.</w:t>
+      </w:r>
+    </w:p>
+    <w:p>
+      <w:pPr>
+        <w:pStyle w:val="ListParagraph"/>
+        <w:numPr>
+          <w:ilvl w:val="0"/>
+          <w:numId w:val="2"/>
+        </w:numPr>
+      </w:pPr>
+      <w:r>
+        <w:t>Changing the path structure does not fix this issue, at least not using the Unreal path structure.</w:t>
+      </w:r>
+    </w:p>
+    <w:p>
+      <w:pPr>
+        <w:pStyle w:val="ListParagraph"/>
+        <w:numPr>
+          <w:ilvl w:val="0"/>
+          <w:numId w:val="2"/>
+        </w:numPr>
+      </w:pPr>
+      <w:r>
+        <w:t>Reverted to an earlier working version with Github, roughly back on track.  nanoModbus compiles again and the editor can be opened again.</w:t>
+      </w:r>
+    </w:p>
+    <w:p>
+      <w:pPr>
+        <w:pStyle w:val="ListParagraph"/>
+        <w:numPr>
+          <w:ilvl w:val="0"/>
+          <w:numId w:val="2"/>
+        </w:numPr>
+      </w:pPr>
+      <w:r>
+        <w:t>So it seems making any sort of change whatsoever to the code causes EVERYTHING to break due to the build path system used by Unreal.  There is some specific system for getting a new build to work that is some combination of deleting Binaries, Intermediate, and DataCache in conjunction with Regenerating The Project.</w:t>
+      </w:r>
+    </w:p>
     <w:p>
       <w:pPr>
         <w:pStyle w:val="ListParagraph"/>
@@ -2440,7 +2707,7 @@
         <w:rFonts w:ascii="Aptos" w:eastAsiaTheme="minorHAnsi" w:hAnsi="Aptos" w:cstheme="minorBidi" w:hint="default"/>
       </w:rPr>
     </w:lvl>
-    <w:lvl w:ilvl="1" w:tplc="04090003" w:tentative="1">
+    <w:lvl w:ilvl="1" w:tplc="04090003">
       <w:start w:val="1"/>
       <w:numFmt w:val="bullet"/>
       <w:lvlText w:val="o"/>

</xml_diff>